<commit_message>
eval: reestructurar Sección II — P1 costo de oportunidad (5pts), P2 dos escenarios (2,5pts c/u)
Cambios de Jorge:
- Pregunta 1 conceptual: de mecanismo de ajuste (4pts) → costo de oportunidad (5pts)
- Pregunta 2 ejercicio: de 3 sub-partes (6pts) → 2 sub-partes a/b (2,5pts c/u = 5pts)
- La (c) "nueva tecnología de horneado" se elimina
- Total Sección II sigue siendo 10pts · Total prueba 20pts

Actualizados: script generador, .docx regenerado, páginas Notion
(Evaluación Regular + Pauta de Corrección con criterios y puntajes nuevos).

Co-Authored-By: Claude Opus 4.7 (1M context) <noreply@anthropic.com>
</commit_message>
<xml_diff>
--- a/docs/evaluaciones/regular-1.docx
+++ b/docs/evaluaciones/regular-1.docx
@@ -1759,33 +1759,51 @@
           <w:sz w:val="22"/>
           <w:szCs w:val="22"/>
         </w:rPr>
-        <w:t xml:space="preserve">Pregunta 1 — Conceptual (4 pts). </w:t>
-      </w:r>
-      <w:r>
-        <w:rPr>
-          <w:rFonts w:ascii="Times New Roman" w:cs="Times New Roman" w:eastAsia="Times New Roman" w:hAnsi="Times New Roman"/>
-          <w:sz w:val="22"/>
-          <w:szCs w:val="22"/>
-        </w:rPr>
-        <w:t xml:space="preserve">Explica qué ocurre en un mercado competitivo cuando el precio de un bien </w:t>
-      </w:r>
-      <w:r>
-        <w:rPr>
-          <w:rFonts w:ascii="Times New Roman" w:cs="Times New Roman" w:eastAsia="Times New Roman" w:hAnsi="Times New Roman"/>
-          <w:b/>
-          <w:bCs/>
-          <w:sz w:val="22"/>
-          <w:szCs w:val="22"/>
-        </w:rPr>
-        <w:t xml:space="preserve">sube por encima del equilibrio</w:t>
-      </w:r>
-      <w:r>
-        <w:rPr>
-          <w:rFonts w:ascii="Times New Roman" w:cs="Times New Roman" w:eastAsia="Times New Roman" w:hAnsi="Times New Roman"/>
-          <w:sz w:val="22"/>
-          <w:szCs w:val="22"/>
-        </w:rPr>
-        <w:t xml:space="preserve">. Describe el mecanismo de ajuste que lleva al mercado de vuelta al equilibrio, mencionando qué roles juegan la ley de la demanda y la ley de la oferta.</w:t>
+        <w:t xml:space="preserve">Pregunta 1 — Conceptual (5 pts). </w:t>
+      </w:r>
+      <w:r>
+        <w:rPr>
+          <w:rFonts w:ascii="Times New Roman" w:cs="Times New Roman" w:eastAsia="Times New Roman" w:hAnsi="Times New Roman"/>
+          <w:sz w:val="22"/>
+          <w:szCs w:val="22"/>
+        </w:rPr>
+        <w:t xml:space="preserve">Explica qué es el </w:t>
+      </w:r>
+      <w:r>
+        <w:rPr>
+          <w:rFonts w:ascii="Times New Roman" w:cs="Times New Roman" w:eastAsia="Times New Roman" w:hAnsi="Times New Roman"/>
+          <w:b/>
+          <w:bCs/>
+          <w:sz w:val="22"/>
+          <w:szCs w:val="22"/>
+        </w:rPr>
+        <w:t xml:space="preserve">costo de oportunidad</w:t>
+      </w:r>
+      <w:r>
+        <w:rPr>
+          <w:rFonts w:ascii="Times New Roman" w:cs="Times New Roman" w:eastAsia="Times New Roman" w:hAnsi="Times New Roman"/>
+          <w:sz w:val="22"/>
+          <w:szCs w:val="22"/>
+        </w:rPr>
+        <w:t xml:space="preserve"> y por qué es relevante para la toma de decisiones económicas. Usa un </w:t>
+      </w:r>
+      <w:r>
+        <w:rPr>
+          <w:rFonts w:ascii="Times New Roman" w:cs="Times New Roman" w:eastAsia="Times New Roman" w:hAnsi="Times New Roman"/>
+          <w:b/>
+          <w:bCs/>
+          <w:sz w:val="22"/>
+          <w:szCs w:val="22"/>
+        </w:rPr>
+        <w:t xml:space="preserve">ejemplo concreto</w:t>
+      </w:r>
+      <w:r>
+        <w:rPr>
+          <w:rFonts w:ascii="Times New Roman" w:cs="Times New Roman" w:eastAsia="Times New Roman" w:hAnsi="Times New Roman"/>
+          <w:sz w:val="22"/>
+          <w:szCs w:val="22"/>
+        </w:rPr>
+        <w:t xml:space="preserve"> para ilustrar tu respuesta.</w:t>
       </w:r>
     </w:p>
     <w:p>
@@ -1902,6 +1920,22 @@
     </w:p>
     <w:p>
       <w:pPr>
+        <w:pBdr>
+          <w:bottom w:val="single" w:color="999999" w:sz="4" w:space="1"/>
+        </w:pBdr>
+        <w:spacing w:after="320" w:line="480"/>
+      </w:pPr>
+      <w:r>
+        <w:rPr>
+          <w:rFonts w:ascii="Times New Roman" w:cs="Times New Roman" w:eastAsia="Times New Roman" w:hAnsi="Times New Roman"/>
+          <w:sz w:val="22"/>
+          <w:szCs w:val="22"/>
+        </w:rPr>
+        <w:t xml:space="preserve"> </w:t>
+      </w:r>
+    </w:p>
+    <w:p>
+      <w:pPr>
         <w:spacing w:after="120" w:before="400" w:line="260"/>
         <w:jc w:val="left"/>
       </w:pPr>
@@ -1913,7 +1947,7 @@
           <w:sz w:val="24"/>
           <w:szCs w:val="24"/>
         </w:rPr>
-        <w:t xml:space="preserve">Pregunta 2 — Ejercicio aplicado: cambios en el equilibrio (6 pts)</w:t>
+        <w:t xml:space="preserve">Pregunta 2 — Ejercicio aplicado: cambios en el equilibrio (5 pts)</w:t>
       </w:r>
     </w:p>
     <w:p>
@@ -2171,7 +2205,7 @@
           <w:sz w:val="22"/>
           <w:szCs w:val="22"/>
         </w:rPr>
-        <w:t xml:space="preserve">(a) (2 pts). </w:t>
+        <w:t xml:space="preserve">(a) (2,5 pts). </w:t>
       </w:r>
       <w:r>
         <w:rPr>
@@ -2250,48 +2284,6 @@
     </w:p>
     <w:p>
       <w:pPr>
-        <w:spacing w:after="160" w:before="0" w:line="260"/>
-        <w:jc w:val="left"/>
-      </w:pPr>
-      <w:r>
-        <w:rPr>
-          <w:rFonts w:ascii="Times New Roman" w:cs="Times New Roman" w:eastAsia="Times New Roman" w:hAnsi="Times New Roman"/>
-          <w:b/>
-          <w:bCs/>
-          <w:sz w:val="22"/>
-          <w:szCs w:val="22"/>
-        </w:rPr>
-        <w:t xml:space="preserve">(b) (2 pts). </w:t>
-      </w:r>
-      <w:r>
-        <w:rPr>
-          <w:rFonts w:ascii="Times New Roman" w:cs="Times New Roman" w:eastAsia="Times New Roman" w:hAnsi="Times New Roman"/>
-          <w:sz w:val="22"/>
-          <w:szCs w:val="22"/>
-        </w:rPr>
-        <w:t xml:space="preserve">El Ministerio de Salud publica un estudio sobre los riesgos del consumo excesivo de harinas blancas y los consumidores </w:t>
-      </w:r>
-      <w:r>
-        <w:rPr>
-          <w:rFonts w:ascii="Times New Roman" w:cs="Times New Roman" w:eastAsia="Times New Roman" w:hAnsi="Times New Roman"/>
-          <w:b/>
-          <w:bCs/>
-          <w:sz w:val="22"/>
-          <w:szCs w:val="22"/>
-        </w:rPr>
-        <w:t xml:space="preserve">reducen su preferencia</w:t>
-      </w:r>
-      <w:r>
-        <w:rPr>
-          <w:rFonts w:ascii="Times New Roman" w:cs="Times New Roman" w:eastAsia="Times New Roman" w:hAnsi="Times New Roman"/>
-          <w:sz w:val="22"/>
-          <w:szCs w:val="22"/>
-        </w:rPr>
-        <w:t xml:space="preserve"> por el pan tradicional.</w:t>
-      </w:r>
-    </w:p>
-    <w:p>
-      <w:pPr>
         <w:pBdr>
           <w:bottom w:val="single" w:color="999999" w:sz="4" w:space="1"/>
         </w:pBdr>
@@ -2308,6 +2300,48 @@
     </w:p>
     <w:p>
       <w:pPr>
+        <w:spacing w:after="160" w:before="0" w:line="260"/>
+        <w:jc w:val="left"/>
+      </w:pPr>
+      <w:r>
+        <w:rPr>
+          <w:rFonts w:ascii="Times New Roman" w:cs="Times New Roman" w:eastAsia="Times New Roman" w:hAnsi="Times New Roman"/>
+          <w:b/>
+          <w:bCs/>
+          <w:sz w:val="22"/>
+          <w:szCs w:val="22"/>
+        </w:rPr>
+        <w:t xml:space="preserve">(b) (2,5 pts). </w:t>
+      </w:r>
+      <w:r>
+        <w:rPr>
+          <w:rFonts w:ascii="Times New Roman" w:cs="Times New Roman" w:eastAsia="Times New Roman" w:hAnsi="Times New Roman"/>
+          <w:sz w:val="22"/>
+          <w:szCs w:val="22"/>
+        </w:rPr>
+        <w:t xml:space="preserve">El Ministerio de Salud publica un estudio sobre los riesgos del consumo excesivo de harinas blancas y los consumidores </w:t>
+      </w:r>
+      <w:r>
+        <w:rPr>
+          <w:rFonts w:ascii="Times New Roman" w:cs="Times New Roman" w:eastAsia="Times New Roman" w:hAnsi="Times New Roman"/>
+          <w:b/>
+          <w:bCs/>
+          <w:sz w:val="22"/>
+          <w:szCs w:val="22"/>
+        </w:rPr>
+        <w:t xml:space="preserve">reducen su preferencia</w:t>
+      </w:r>
+      <w:r>
+        <w:rPr>
+          <w:rFonts w:ascii="Times New Roman" w:cs="Times New Roman" w:eastAsia="Times New Roman" w:hAnsi="Times New Roman"/>
+          <w:sz w:val="22"/>
+          <w:szCs w:val="22"/>
+        </w:rPr>
+        <w:t xml:space="preserve"> por el pan tradicional.</w:t>
+      </w:r>
+    </w:p>
+    <w:p>
+      <w:pPr>
         <w:pBdr>
           <w:bottom w:val="single" w:color="999999" w:sz="4" w:space="1"/>
         </w:pBdr>
@@ -2320,64 +2354,6 @@
           <w:szCs w:val="22"/>
         </w:rPr>
         <w:t xml:space="preserve"> </w:t>
-      </w:r>
-    </w:p>
-    <w:p>
-      <w:pPr>
-        <w:pBdr>
-          <w:bottom w:val="single" w:color="999999" w:sz="4" w:space="1"/>
-        </w:pBdr>
-        <w:spacing w:after="320" w:line="480"/>
-      </w:pPr>
-      <w:r>
-        <w:rPr>
-          <w:rFonts w:ascii="Times New Roman" w:cs="Times New Roman" w:eastAsia="Times New Roman" w:hAnsi="Times New Roman"/>
-          <w:sz w:val="22"/>
-          <w:szCs w:val="22"/>
-        </w:rPr>
-        <w:t xml:space="preserve"> </w:t>
-      </w:r>
-    </w:p>
-    <w:p>
-      <w:pPr>
-        <w:spacing w:after="160" w:before="0" w:line="260"/>
-        <w:jc w:val="left"/>
-      </w:pPr>
-      <w:r>
-        <w:rPr>
-          <w:rFonts w:ascii="Times New Roman" w:cs="Times New Roman" w:eastAsia="Times New Roman" w:hAnsi="Times New Roman"/>
-          <w:b/>
-          <w:bCs/>
-          <w:sz w:val="22"/>
-          <w:szCs w:val="22"/>
-        </w:rPr>
-        <w:t xml:space="preserve">(c) (2 pts). </w:t>
-      </w:r>
-      <w:r>
-        <w:rPr>
-          <w:rFonts w:ascii="Times New Roman" w:cs="Times New Roman" w:eastAsia="Times New Roman" w:hAnsi="Times New Roman"/>
-          <w:sz w:val="22"/>
-          <w:szCs w:val="22"/>
-        </w:rPr>
-        <w:t xml:space="preserve">Una </w:t>
-      </w:r>
-      <w:r>
-        <w:rPr>
-          <w:rFonts w:ascii="Times New Roman" w:cs="Times New Roman" w:eastAsia="Times New Roman" w:hAnsi="Times New Roman"/>
-          <w:b/>
-          <w:bCs/>
-          <w:sz w:val="22"/>
-          <w:szCs w:val="22"/>
-        </w:rPr>
-        <w:t xml:space="preserve">nueva tecnología de horneado</w:t>
-      </w:r>
-      <w:r>
-        <w:rPr>
-          <w:rFonts w:ascii="Times New Roman" w:cs="Times New Roman" w:eastAsia="Times New Roman" w:hAnsi="Times New Roman"/>
-          <w:sz w:val="22"/>
-          <w:szCs w:val="22"/>
-        </w:rPr>
-        <w:t xml:space="preserve"> reduce el costo unitario de producción del pan.</w:t>
       </w:r>
     </w:p>
     <w:p>

</xml_diff>

<commit_message>
fix(docx): imagen PNG con extensión correcta + actualizar contenido a versión final
Dos cambios:

1. Fix bug de "recuperar" / "bloqueado" al abrir en Word:
   ImageRun ahora lleva `type: 'png'` explícito. Sin él, la librería
   docx guardaba la imagen del diagrama como `*.undefined` dentro del
   zip, lo que forzaba a Word a entrar en modo recuperación.
   Ahora se guarda como word/media/<hash>.png y abre limpio.

2. Contenido del .docx alineado a la versión final del PDF:
   - P1 en orden a/b/c/d (correcta d: recursos limitados)
   - Preguntas 7-10 reordenadas: 7 impuesto · 8 peso muerto ·
     9 externalidad (distractor c = transporte público) · 10 precio máximo
   - Letras de alternativas en minúsculas
   - P2b: "Ministerio de Salud Pública publica un estudio..."

Co-Authored-By: Claude Opus 4.7 (1M context) <noreply@anthropic.com>
</commit_message>
<xml_diff>
--- a/docs/evaluaciones/regular-1.docx
+++ b/docs/evaluaciones/regular-1.docx
@@ -317,7 +317,7 @@
           <w:sz w:val="22"/>
           <w:szCs w:val="22"/>
         </w:rPr>
-        <w:t xml:space="preserve">A) </w:t>
+        <w:t xml:space="preserve">a) </w:t>
       </w:r>
       <w:r>
         <w:rPr>
@@ -341,7 +341,7 @@
           <w:sz w:val="22"/>
           <w:szCs w:val="22"/>
         </w:rPr>
-        <w:t xml:space="preserve">B) </w:t>
+        <w:t xml:space="preserve">b) </w:t>
       </w:r>
       <w:r>
         <w:rPr>
@@ -365,7 +365,31 @@
           <w:sz w:val="22"/>
           <w:szCs w:val="22"/>
         </w:rPr>
-        <w:t xml:space="preserve">C) </w:t>
+        <w:t xml:space="preserve">c) </w:t>
+      </w:r>
+      <w:r>
+        <w:rPr>
+          <w:rFonts w:ascii="Times New Roman" w:cs="Times New Roman" w:eastAsia="Times New Roman" w:hAnsi="Times New Roman"/>
+          <w:sz w:val="22"/>
+          <w:szCs w:val="22"/>
+        </w:rPr>
+        <w:t xml:space="preserve">La escasez desaparece cuando una economía crece lo suficiente.</w:t>
+      </w:r>
+    </w:p>
+    <w:p>
+      <w:pPr>
+        <w:spacing w:after="80" w:line="260"/>
+        <w:ind w:left="720"/>
+      </w:pPr>
+      <w:r>
+        <w:rPr>
+          <w:rFonts w:ascii="Times New Roman" w:cs="Times New Roman" w:eastAsia="Times New Roman" w:hAnsi="Times New Roman"/>
+          <w:b/>
+          <w:bCs/>
+          <w:sz w:val="22"/>
+          <w:szCs w:val="22"/>
+        </w:rPr>
+        <w:t xml:space="preserve">d) </w:t>
       </w:r>
       <w:r>
         <w:rPr>
@@ -378,30 +402,6 @@
     </w:p>
     <w:p>
       <w:pPr>
-        <w:spacing w:after="80" w:line="260"/>
-        <w:ind w:left="720"/>
-      </w:pPr>
-      <w:r>
-        <w:rPr>
-          <w:rFonts w:ascii="Times New Roman" w:cs="Times New Roman" w:eastAsia="Times New Roman" w:hAnsi="Times New Roman"/>
-          <w:b/>
-          <w:bCs/>
-          <w:sz w:val="22"/>
-          <w:szCs w:val="22"/>
-        </w:rPr>
-        <w:t xml:space="preserve">D) </w:t>
-      </w:r>
-      <w:r>
-        <w:rPr>
-          <w:rFonts w:ascii="Times New Roman" w:cs="Times New Roman" w:eastAsia="Times New Roman" w:hAnsi="Times New Roman"/>
-          <w:sz w:val="22"/>
-          <w:szCs w:val="22"/>
-        </w:rPr>
-        <w:t xml:space="preserve">La escasez desaparece cuando una economía crece lo suficiente.</w:t>
-      </w:r>
-    </w:p>
-    <w:p>
-      <w:pPr>
         <w:spacing w:after="120" w:before="0" w:line="260"/>
         <w:jc w:val="left"/>
       </w:pPr>
@@ -469,7 +469,7 @@
           <w:sz w:val="22"/>
           <w:szCs w:val="22"/>
         </w:rPr>
-        <w:t xml:space="preserve">A) </w:t>
+        <w:t xml:space="preserve">a) </w:t>
       </w:r>
       <w:r>
         <w:rPr>
@@ -493,7 +493,7 @@
           <w:sz w:val="22"/>
           <w:szCs w:val="22"/>
         </w:rPr>
-        <w:t xml:space="preserve">B) </w:t>
+        <w:t xml:space="preserve">b) </w:t>
       </w:r>
       <w:r>
         <w:rPr>
@@ -517,7 +517,7 @@
           <w:sz w:val="22"/>
           <w:szCs w:val="22"/>
         </w:rPr>
-        <w:t xml:space="preserve">C) </w:t>
+        <w:t xml:space="preserve">c) </w:t>
       </w:r>
       <w:r>
         <w:rPr>
@@ -541,7 +541,7 @@
           <w:sz w:val="22"/>
           <w:szCs w:val="22"/>
         </w:rPr>
-        <w:t xml:space="preserve">D) </w:t>
+        <w:t xml:space="preserve">d) </w:t>
       </w:r>
       <w:r>
         <w:rPr>
@@ -603,7 +603,7 @@
           <w:sz w:val="22"/>
           <w:szCs w:val="22"/>
         </w:rPr>
-        <w:t xml:space="preserve">A) </w:t>
+        <w:t xml:space="preserve">a) </w:t>
       </w:r>
       <w:r>
         <w:rPr>
@@ -627,7 +627,7 @@
           <w:sz w:val="22"/>
           <w:szCs w:val="22"/>
         </w:rPr>
-        <w:t xml:space="preserve">B) </w:t>
+        <w:t xml:space="preserve">b) </w:t>
       </w:r>
       <w:r>
         <w:rPr>
@@ -651,7 +651,7 @@
           <w:sz w:val="22"/>
           <w:szCs w:val="22"/>
         </w:rPr>
-        <w:t xml:space="preserve">C) </w:t>
+        <w:t xml:space="preserve">c) </w:t>
       </w:r>
       <w:r>
         <w:rPr>
@@ -675,7 +675,7 @@
           <w:sz w:val="22"/>
           <w:szCs w:val="22"/>
         </w:rPr>
-        <w:t xml:space="preserve">D) </w:t>
+        <w:t xml:space="preserve">d) </w:t>
       </w:r>
       <w:r>
         <w:rPr>
@@ -755,7 +755,7 @@
           <w:sz w:val="22"/>
           <w:szCs w:val="22"/>
         </w:rPr>
-        <w:t xml:space="preserve">A) </w:t>
+        <w:t xml:space="preserve">a) </w:t>
       </w:r>
       <w:r>
         <w:rPr>
@@ -779,7 +779,7 @@
           <w:sz w:val="22"/>
           <w:szCs w:val="22"/>
         </w:rPr>
-        <w:t xml:space="preserve">B) </w:t>
+        <w:t xml:space="preserve">b) </w:t>
       </w:r>
       <w:r>
         <w:rPr>
@@ -803,7 +803,7 @@
           <w:sz w:val="22"/>
           <w:szCs w:val="22"/>
         </w:rPr>
-        <w:t xml:space="preserve">C) </w:t>
+        <w:t xml:space="preserve">c) </w:t>
       </w:r>
       <w:r>
         <w:rPr>
@@ -827,7 +827,7 @@
           <w:sz w:val="22"/>
           <w:szCs w:val="22"/>
         </w:rPr>
-        <w:t xml:space="preserve">D) </w:t>
+        <w:t xml:space="preserve">d) </w:t>
       </w:r>
       <w:r>
         <w:rPr>
@@ -891,23 +891,23 @@
           <w:sz w:val="22"/>
           <w:szCs w:val="22"/>
         </w:rPr>
-        <w:t xml:space="preserve"> (aumenta la oferta)?</w:t>
-      </w:r>
-    </w:p>
-    <w:p>
-      <w:pPr>
-        <w:spacing w:after="80" w:line="260"/>
-        <w:ind w:left="720"/>
-      </w:pPr>
-      <w:r>
-        <w:rPr>
-          <w:rFonts w:ascii="Times New Roman" w:cs="Times New Roman" w:eastAsia="Times New Roman" w:hAnsi="Times New Roman"/>
-          <w:b/>
-          <w:bCs/>
-          <w:sz w:val="22"/>
-          <w:szCs w:val="22"/>
-        </w:rPr>
-        <w:t xml:space="preserve">A) </w:t>
+        <w:t xml:space="preserve">?</w:t>
+      </w:r>
+    </w:p>
+    <w:p>
+      <w:pPr>
+        <w:spacing w:after="80" w:line="260"/>
+        <w:ind w:left="720"/>
+      </w:pPr>
+      <w:r>
+        <w:rPr>
+          <w:rFonts w:ascii="Times New Roman" w:cs="Times New Roman" w:eastAsia="Times New Roman" w:hAnsi="Times New Roman"/>
+          <w:b/>
+          <w:bCs/>
+          <w:sz w:val="22"/>
+          <w:szCs w:val="22"/>
+        </w:rPr>
+        <w:t xml:space="preserve">a) </w:t>
       </w:r>
       <w:r>
         <w:rPr>
@@ -931,7 +931,7 @@
           <w:sz w:val="22"/>
           <w:szCs w:val="22"/>
         </w:rPr>
-        <w:t xml:space="preserve">B) </w:t>
+        <w:t xml:space="preserve">b) </w:t>
       </w:r>
       <w:r>
         <w:rPr>
@@ -955,7 +955,7 @@
           <w:sz w:val="22"/>
           <w:szCs w:val="22"/>
         </w:rPr>
-        <w:t xml:space="preserve">C) </w:t>
+        <w:t xml:space="preserve">c) </w:t>
       </w:r>
       <w:r>
         <w:rPr>
@@ -979,15 +979,15 @@
           <w:sz w:val="22"/>
           <w:szCs w:val="22"/>
         </w:rPr>
-        <w:t xml:space="preserve">D) </w:t>
-      </w:r>
-      <w:r>
-        <w:rPr>
-          <w:rFonts w:ascii="Times New Roman" w:cs="Times New Roman" w:eastAsia="Times New Roman" w:hAnsi="Times New Roman"/>
-          <w:sz w:val="22"/>
-          <w:szCs w:val="22"/>
-        </w:rPr>
-        <w:t xml:space="preserve">A y B.</w:t>
+        <w:t xml:space="preserve">d) </w:t>
+      </w:r>
+      <w:r>
+        <w:rPr>
+          <w:rFonts w:ascii="Times New Roman" w:cs="Times New Roman" w:eastAsia="Times New Roman" w:hAnsi="Times New Roman"/>
+          <w:sz w:val="22"/>
+          <w:szCs w:val="22"/>
+        </w:rPr>
+        <w:t xml:space="preserve">Las alternativas a) y b).</w:t>
       </w:r>
     </w:p>
     <w:p>
@@ -1059,7 +1059,7 @@
           <w:sz w:val="22"/>
           <w:szCs w:val="22"/>
         </w:rPr>
-        <w:t xml:space="preserve">A) </w:t>
+        <w:t xml:space="preserve">a) </w:t>
       </w:r>
       <w:r>
         <w:rPr>
@@ -1083,7 +1083,7 @@
           <w:sz w:val="22"/>
           <w:szCs w:val="22"/>
         </w:rPr>
-        <w:t xml:space="preserve">B) </w:t>
+        <w:t xml:space="preserve">b) </w:t>
       </w:r>
       <w:r>
         <w:rPr>
@@ -1107,7 +1107,7 @@
           <w:sz w:val="22"/>
           <w:szCs w:val="22"/>
         </w:rPr>
-        <w:t xml:space="preserve">C) </w:t>
+        <w:t xml:space="preserve">c) </w:t>
       </w:r>
       <w:r>
         <w:rPr>
@@ -1131,7 +1131,7 @@
           <w:sz w:val="22"/>
           <w:szCs w:val="22"/>
         </w:rPr>
-        <w:t xml:space="preserve">D) </w:t>
+        <w:t xml:space="preserve">d) </w:t>
       </w:r>
       <w:r>
         <w:rPr>
@@ -1177,6 +1177,444 @@
           <w:sz w:val="22"/>
           <w:szCs w:val="22"/>
         </w:rPr>
+        <w:t xml:space="preserve">  Cuando el gobierno aplica un impuesto sobre las ventas de un bien, ¿quién soporta la carga tributaria?</w:t>
+      </w:r>
+    </w:p>
+    <w:p>
+      <w:pPr>
+        <w:spacing w:after="80" w:line="260"/>
+        <w:ind w:left="720"/>
+      </w:pPr>
+      <w:r>
+        <w:rPr>
+          <w:rFonts w:ascii="Times New Roman" w:cs="Times New Roman" w:eastAsia="Times New Roman" w:hAnsi="Times New Roman"/>
+          <w:b/>
+          <w:bCs/>
+          <w:sz w:val="22"/>
+          <w:szCs w:val="22"/>
+        </w:rPr>
+        <w:t xml:space="preserve">a) </w:t>
+      </w:r>
+      <w:r>
+        <w:rPr>
+          <w:rFonts w:ascii="Times New Roman" w:cs="Times New Roman" w:eastAsia="Times New Roman" w:hAnsi="Times New Roman"/>
+          <w:sz w:val="22"/>
+          <w:szCs w:val="22"/>
+        </w:rPr>
+        <w:t xml:space="preserve">Siempre el vendedor, porque es quien paga el impuesto formalmente.</w:t>
+      </w:r>
+    </w:p>
+    <w:p>
+      <w:pPr>
+        <w:spacing w:after="80" w:line="260"/>
+        <w:ind w:left="720"/>
+      </w:pPr>
+      <w:r>
+        <w:rPr>
+          <w:rFonts w:ascii="Times New Roman" w:cs="Times New Roman" w:eastAsia="Times New Roman" w:hAnsi="Times New Roman"/>
+          <w:b/>
+          <w:bCs/>
+          <w:sz w:val="22"/>
+          <w:szCs w:val="22"/>
+        </w:rPr>
+        <w:t xml:space="preserve">b) </w:t>
+      </w:r>
+      <w:r>
+        <w:rPr>
+          <w:rFonts w:ascii="Times New Roman" w:cs="Times New Roman" w:eastAsia="Times New Roman" w:hAnsi="Times New Roman"/>
+          <w:sz w:val="22"/>
+          <w:szCs w:val="22"/>
+        </w:rPr>
+        <w:t xml:space="preserve">Siempre el comprador, porque es quien consume el bien.</w:t>
+      </w:r>
+    </w:p>
+    <w:p>
+      <w:pPr>
+        <w:spacing w:after="80" w:line="260"/>
+        <w:ind w:left="720"/>
+      </w:pPr>
+      <w:r>
+        <w:rPr>
+          <w:rFonts w:ascii="Times New Roman" w:cs="Times New Roman" w:eastAsia="Times New Roman" w:hAnsi="Times New Roman"/>
+          <w:b/>
+          <w:bCs/>
+          <w:sz w:val="22"/>
+          <w:szCs w:val="22"/>
+        </w:rPr>
+        <w:t xml:space="preserve">c) </w:t>
+      </w:r>
+      <w:r>
+        <w:rPr>
+          <w:rFonts w:ascii="Times New Roman" w:cs="Times New Roman" w:eastAsia="Times New Roman" w:hAnsi="Times New Roman"/>
+          <w:sz w:val="22"/>
+          <w:szCs w:val="22"/>
+        </w:rPr>
+        <w:t xml:space="preserve">La carga se distribuye entre ambos según sus elasticidades, sin importar a quién se cobre formalmente.</w:t>
+      </w:r>
+    </w:p>
+    <w:p>
+      <w:pPr>
+        <w:spacing w:after="80" w:line="260"/>
+        <w:ind w:left="720"/>
+      </w:pPr>
+      <w:r>
+        <w:rPr>
+          <w:rFonts w:ascii="Times New Roman" w:cs="Times New Roman" w:eastAsia="Times New Roman" w:hAnsi="Times New Roman"/>
+          <w:b/>
+          <w:bCs/>
+          <w:sz w:val="22"/>
+          <w:szCs w:val="22"/>
+        </w:rPr>
+        <w:t xml:space="preserve">d) </w:t>
+      </w:r>
+      <w:r>
+        <w:rPr>
+          <w:rFonts w:ascii="Times New Roman" w:cs="Times New Roman" w:eastAsia="Times New Roman" w:hAnsi="Times New Roman"/>
+          <w:sz w:val="22"/>
+          <w:szCs w:val="22"/>
+        </w:rPr>
+        <w:t xml:space="preserve">El gobierno, porque es quien recauda el impuesto.</w:t>
+      </w:r>
+    </w:p>
+    <w:p>
+      <w:pPr>
+        <w:spacing w:after="120" w:before="0" w:line="260"/>
+        <w:jc w:val="left"/>
+      </w:pPr>
+      <w:r>
+        <w:rPr>
+          <w:rFonts w:ascii="Times New Roman" w:cs="Times New Roman" w:eastAsia="Times New Roman" w:hAnsi="Times New Roman"/>
+          <w:sz w:val="22"/>
+          <w:szCs w:val="22"/>
+        </w:rPr>
+        <w:t xml:space="preserve"/>
+      </w:r>
+    </w:p>
+    <w:p>
+      <w:pPr>
+        <w:spacing w:after="80" w:before="0" w:line="260"/>
+        <w:jc w:val="left"/>
+      </w:pPr>
+      <w:r>
+        <w:rPr>
+          <w:rFonts w:ascii="Times New Roman" w:cs="Times New Roman" w:eastAsia="Times New Roman" w:hAnsi="Times New Roman"/>
+          <w:b/>
+          <w:bCs/>
+          <w:sz w:val="22"/>
+          <w:szCs w:val="22"/>
+        </w:rPr>
+        <w:t xml:space="preserve">8.</w:t>
+      </w:r>
+      <w:r>
+        <w:rPr>
+          <w:rFonts w:ascii="Times New Roman" w:cs="Times New Roman" w:eastAsia="Times New Roman" w:hAnsi="Times New Roman"/>
+          <w:sz w:val="22"/>
+          <w:szCs w:val="22"/>
+        </w:rPr>
+        <w:t xml:space="preserve">  El </w:t>
+      </w:r>
+      <w:r>
+        <w:rPr>
+          <w:rFonts w:ascii="Times New Roman" w:cs="Times New Roman" w:eastAsia="Times New Roman" w:hAnsi="Times New Roman"/>
+          <w:b/>
+          <w:bCs/>
+          <w:sz w:val="22"/>
+          <w:szCs w:val="22"/>
+        </w:rPr>
+        <w:t xml:space="preserve">peso muerto</w:t>
+      </w:r>
+      <w:r>
+        <w:rPr>
+          <w:rFonts w:ascii="Times New Roman" w:cs="Times New Roman" w:eastAsia="Times New Roman" w:hAnsi="Times New Roman"/>
+          <w:sz w:val="22"/>
+          <w:szCs w:val="22"/>
+        </w:rPr>
+        <w:t xml:space="preserve"> de un impuesto es:</w:t>
+      </w:r>
+    </w:p>
+    <w:p>
+      <w:pPr>
+        <w:spacing w:after="80" w:line="260"/>
+        <w:ind w:left="720"/>
+      </w:pPr>
+      <w:r>
+        <w:rPr>
+          <w:rFonts w:ascii="Times New Roman" w:cs="Times New Roman" w:eastAsia="Times New Roman" w:hAnsi="Times New Roman"/>
+          <w:b/>
+          <w:bCs/>
+          <w:sz w:val="22"/>
+          <w:szCs w:val="22"/>
+        </w:rPr>
+        <w:t xml:space="preserve">a) </w:t>
+      </w:r>
+      <w:r>
+        <w:rPr>
+          <w:rFonts w:ascii="Times New Roman" w:cs="Times New Roman" w:eastAsia="Times New Roman" w:hAnsi="Times New Roman"/>
+          <w:sz w:val="22"/>
+          <w:szCs w:val="22"/>
+        </w:rPr>
+        <w:t xml:space="preserve">El ingreso total que recauda el gobierno.</w:t>
+      </w:r>
+    </w:p>
+    <w:p>
+      <w:pPr>
+        <w:spacing w:after="80" w:line="260"/>
+        <w:ind w:left="720"/>
+      </w:pPr>
+      <w:r>
+        <w:rPr>
+          <w:rFonts w:ascii="Times New Roman" w:cs="Times New Roman" w:eastAsia="Times New Roman" w:hAnsi="Times New Roman"/>
+          <w:b/>
+          <w:bCs/>
+          <w:sz w:val="22"/>
+          <w:szCs w:val="22"/>
+        </w:rPr>
+        <w:t xml:space="preserve">b) </w:t>
+      </w:r>
+      <w:r>
+        <w:rPr>
+          <w:rFonts w:ascii="Times New Roman" w:cs="Times New Roman" w:eastAsia="Times New Roman" w:hAnsi="Times New Roman"/>
+          <w:sz w:val="22"/>
+          <w:szCs w:val="22"/>
+        </w:rPr>
+        <w:t xml:space="preserve">La reducción del excedente del consumidor que pasa al gobierno como recaudación.</w:t>
+      </w:r>
+    </w:p>
+    <w:p>
+      <w:pPr>
+        <w:spacing w:after="80" w:line="260"/>
+        <w:ind w:left="720"/>
+      </w:pPr>
+      <w:r>
+        <w:rPr>
+          <w:rFonts w:ascii="Times New Roman" w:cs="Times New Roman" w:eastAsia="Times New Roman" w:hAnsi="Times New Roman"/>
+          <w:b/>
+          <w:bCs/>
+          <w:sz w:val="22"/>
+          <w:szCs w:val="22"/>
+        </w:rPr>
+        <w:t xml:space="preserve">c) </w:t>
+      </w:r>
+      <w:r>
+        <w:rPr>
+          <w:rFonts w:ascii="Times New Roman" w:cs="Times New Roman" w:eastAsia="Times New Roman" w:hAnsi="Times New Roman"/>
+          <w:sz w:val="22"/>
+          <w:szCs w:val="22"/>
+        </w:rPr>
+        <w:t xml:space="preserve">La pérdida de bienestar que no captura ningún agente: ni compradores, ni vendedores, ni el gobierno.</w:t>
+      </w:r>
+    </w:p>
+    <w:p>
+      <w:pPr>
+        <w:spacing w:after="80" w:line="260"/>
+        <w:ind w:left="720"/>
+      </w:pPr>
+      <w:r>
+        <w:rPr>
+          <w:rFonts w:ascii="Times New Roman" w:cs="Times New Roman" w:eastAsia="Times New Roman" w:hAnsi="Times New Roman"/>
+          <w:b/>
+          <w:bCs/>
+          <w:sz w:val="22"/>
+          <w:szCs w:val="22"/>
+        </w:rPr>
+        <w:t xml:space="preserve">d) </w:t>
+      </w:r>
+      <w:r>
+        <w:rPr>
+          <w:rFonts w:ascii="Times New Roman" w:cs="Times New Roman" w:eastAsia="Times New Roman" w:hAnsi="Times New Roman"/>
+          <w:sz w:val="22"/>
+          <w:szCs w:val="22"/>
+        </w:rPr>
+        <w:t xml:space="preserve">El costo administrativo de recaudar el impuesto.</w:t>
+      </w:r>
+    </w:p>
+    <w:p>
+      <w:pPr>
+        <w:spacing w:after="120" w:before="0" w:line="260"/>
+        <w:jc w:val="left"/>
+      </w:pPr>
+      <w:r>
+        <w:rPr>
+          <w:rFonts w:ascii="Times New Roman" w:cs="Times New Roman" w:eastAsia="Times New Roman" w:hAnsi="Times New Roman"/>
+          <w:sz w:val="22"/>
+          <w:szCs w:val="22"/>
+        </w:rPr>
+        <w:t xml:space="preserve"/>
+      </w:r>
+    </w:p>
+    <w:p>
+      <w:pPr>
+        <w:spacing w:after="80" w:before="0" w:line="260"/>
+        <w:jc w:val="left"/>
+      </w:pPr>
+      <w:r>
+        <w:rPr>
+          <w:rFonts w:ascii="Times New Roman" w:cs="Times New Roman" w:eastAsia="Times New Roman" w:hAnsi="Times New Roman"/>
+          <w:b/>
+          <w:bCs/>
+          <w:sz w:val="22"/>
+          <w:szCs w:val="22"/>
+        </w:rPr>
+        <w:t xml:space="preserve">9.</w:t>
+      </w:r>
+      <w:r>
+        <w:rPr>
+          <w:rFonts w:ascii="Times New Roman" w:cs="Times New Roman" w:eastAsia="Times New Roman" w:hAnsi="Times New Roman"/>
+          <w:sz w:val="22"/>
+          <w:szCs w:val="22"/>
+        </w:rPr>
+        <w:t xml:space="preserve">  ¿Cuál de las siguientes situaciones es un ejemplo de </w:t>
+      </w:r>
+      <w:r>
+        <w:rPr>
+          <w:rFonts w:ascii="Times New Roman" w:cs="Times New Roman" w:eastAsia="Times New Roman" w:hAnsi="Times New Roman"/>
+          <w:b/>
+          <w:bCs/>
+          <w:sz w:val="22"/>
+          <w:szCs w:val="22"/>
+        </w:rPr>
+        <w:t xml:space="preserve">externalidad negativa</w:t>
+      </w:r>
+      <w:r>
+        <w:rPr>
+          <w:rFonts w:ascii="Times New Roman" w:cs="Times New Roman" w:eastAsia="Times New Roman" w:hAnsi="Times New Roman"/>
+          <w:sz w:val="22"/>
+          <w:szCs w:val="22"/>
+        </w:rPr>
+        <w:t xml:space="preserve">?</w:t>
+      </w:r>
+    </w:p>
+    <w:p>
+      <w:pPr>
+        <w:spacing w:after="80" w:line="260"/>
+        <w:ind w:left="720"/>
+      </w:pPr>
+      <w:r>
+        <w:rPr>
+          <w:rFonts w:ascii="Times New Roman" w:cs="Times New Roman" w:eastAsia="Times New Roman" w:hAnsi="Times New Roman"/>
+          <w:b/>
+          <w:bCs/>
+          <w:sz w:val="22"/>
+          <w:szCs w:val="22"/>
+        </w:rPr>
+        <w:t xml:space="preserve">a) </w:t>
+      </w:r>
+      <w:r>
+        <w:rPr>
+          <w:rFonts w:ascii="Times New Roman" w:cs="Times New Roman" w:eastAsia="Times New Roman" w:hAnsi="Times New Roman"/>
+          <w:sz w:val="22"/>
+          <w:szCs w:val="22"/>
+        </w:rPr>
+        <w:t xml:space="preserve">Una vacuna que protege a quienes rodean al vacunado.</w:t>
+      </w:r>
+    </w:p>
+    <w:p>
+      <w:pPr>
+        <w:spacing w:after="80" w:line="260"/>
+        <w:ind w:left="720"/>
+      </w:pPr>
+      <w:r>
+        <w:rPr>
+          <w:rFonts w:ascii="Times New Roman" w:cs="Times New Roman" w:eastAsia="Times New Roman" w:hAnsi="Times New Roman"/>
+          <w:b/>
+          <w:bCs/>
+          <w:sz w:val="22"/>
+          <w:szCs w:val="22"/>
+        </w:rPr>
+        <w:t xml:space="preserve">b) </w:t>
+      </w:r>
+      <w:r>
+        <w:rPr>
+          <w:rFonts w:ascii="Times New Roman" w:cs="Times New Roman" w:eastAsia="Times New Roman" w:hAnsi="Times New Roman"/>
+          <w:sz w:val="22"/>
+          <w:szCs w:val="22"/>
+        </w:rPr>
+        <w:t xml:space="preserve">Una fábrica que contamina el río con sus desechos industriales, perjudicando a los vecinos.</w:t>
+      </w:r>
+    </w:p>
+    <w:p>
+      <w:pPr>
+        <w:spacing w:after="80" w:line="260"/>
+        <w:ind w:left="720"/>
+      </w:pPr>
+      <w:r>
+        <w:rPr>
+          <w:rFonts w:ascii="Times New Roman" w:cs="Times New Roman" w:eastAsia="Times New Roman" w:hAnsi="Times New Roman"/>
+          <w:b/>
+          <w:bCs/>
+          <w:sz w:val="22"/>
+          <w:szCs w:val="22"/>
+        </w:rPr>
+        <w:t xml:space="preserve">c) </w:t>
+      </w:r>
+      <w:r>
+        <w:rPr>
+          <w:rFonts w:ascii="Times New Roman" w:cs="Times New Roman" w:eastAsia="Times New Roman" w:hAnsi="Times New Roman"/>
+          <w:sz w:val="22"/>
+          <w:szCs w:val="22"/>
+        </w:rPr>
+        <w:t xml:space="preserve">Un subsidio estatal al transporte público.</w:t>
+      </w:r>
+    </w:p>
+    <w:p>
+      <w:pPr>
+        <w:spacing w:after="80" w:line="260"/>
+        <w:ind w:left="720"/>
+      </w:pPr>
+      <w:r>
+        <w:rPr>
+          <w:rFonts w:ascii="Times New Roman" w:cs="Times New Roman" w:eastAsia="Times New Roman" w:hAnsi="Times New Roman"/>
+          <w:b/>
+          <w:bCs/>
+          <w:sz w:val="22"/>
+          <w:szCs w:val="22"/>
+        </w:rPr>
+        <w:t xml:space="preserve">d) </w:t>
+      </w:r>
+      <w:r>
+        <w:rPr>
+          <w:rFonts w:ascii="Times New Roman" w:cs="Times New Roman" w:eastAsia="Times New Roman" w:hAnsi="Times New Roman"/>
+          <w:sz w:val="22"/>
+          <w:szCs w:val="22"/>
+        </w:rPr>
+        <w:t xml:space="preserve">Todas las anteriores son externalidades.</w:t>
+      </w:r>
+    </w:p>
+    <w:p>
+      <w:pPr>
+        <w:spacing w:after="120" w:before="0" w:line="260"/>
+        <w:jc w:val="left"/>
+      </w:pPr>
+      <w:r>
+        <w:rPr>
+          <w:rFonts w:ascii="Times New Roman" w:cs="Times New Roman" w:eastAsia="Times New Roman" w:hAnsi="Times New Roman"/>
+          <w:sz w:val="22"/>
+          <w:szCs w:val="22"/>
+        </w:rPr>
+        <w:t xml:space="preserve"/>
+      </w:r>
+    </w:p>
+    <w:p>
+      <w:pPr>
+        <w:spacing w:after="80" w:before="0" w:line="260"/>
+        <w:jc w:val="left"/>
+      </w:pPr>
+      <w:r>
+        <w:rPr>
+          <w:rFonts w:ascii="Times New Roman" w:cs="Times New Roman" w:eastAsia="Times New Roman" w:hAnsi="Times New Roman"/>
+          <w:b/>
+          <w:bCs/>
+          <w:sz w:val="22"/>
+          <w:szCs w:val="22"/>
+        </w:rPr>
+        <w:t xml:space="preserve">10.</w:t>
+      </w:r>
+      <w:r>
+        <w:rPr>
+          <w:rFonts w:ascii="Times New Roman" w:cs="Times New Roman" w:eastAsia="Times New Roman" w:hAnsi="Times New Roman"/>
+          <w:sz w:val="22"/>
+          <w:szCs w:val="22"/>
+        </w:rPr>
         <w:t xml:space="preserve">  Un precio máximo genera escasez cuando se fija:</w:t>
       </w:r>
     </w:p>
@@ -1193,7 +1631,7 @@
           <w:sz w:val="22"/>
           <w:szCs w:val="22"/>
         </w:rPr>
-        <w:t xml:space="preserve">A) </w:t>
+        <w:t xml:space="preserve">a) </w:t>
       </w:r>
       <w:r>
         <w:rPr>
@@ -1217,7 +1655,7 @@
           <w:sz w:val="22"/>
           <w:szCs w:val="22"/>
         </w:rPr>
-        <w:t xml:space="preserve">B) </w:t>
+        <w:t xml:space="preserve">b) </w:t>
       </w:r>
       <w:r>
         <w:rPr>
@@ -1241,7 +1679,7 @@
           <w:sz w:val="22"/>
           <w:szCs w:val="22"/>
         </w:rPr>
-        <w:t xml:space="preserve">C) </w:t>
+        <w:t xml:space="preserve">c) </w:t>
       </w:r>
       <w:r>
         <w:rPr>
@@ -1265,7 +1703,7 @@
           <w:sz w:val="22"/>
           <w:szCs w:val="22"/>
         </w:rPr>
-        <w:t xml:space="preserve">D) </w:t>
+        <w:t xml:space="preserve">d) </w:t>
       </w:r>
       <w:r>
         <w:rPr>
@@ -1274,444 +1712,6 @@
           <w:szCs w:val="22"/>
         </w:rPr>
         <w:t xml:space="preserve">Ninguna de las anteriores: un precio máximo nunca genera escasez.</w:t>
-      </w:r>
-    </w:p>
-    <w:p>
-      <w:pPr>
-        <w:spacing w:after="120" w:before="0" w:line="260"/>
-        <w:jc w:val="left"/>
-      </w:pPr>
-      <w:r>
-        <w:rPr>
-          <w:rFonts w:ascii="Times New Roman" w:cs="Times New Roman" w:eastAsia="Times New Roman" w:hAnsi="Times New Roman"/>
-          <w:sz w:val="22"/>
-          <w:szCs w:val="22"/>
-        </w:rPr>
-        <w:t xml:space="preserve"/>
-      </w:r>
-    </w:p>
-    <w:p>
-      <w:pPr>
-        <w:spacing w:after="80" w:before="0" w:line="260"/>
-        <w:jc w:val="left"/>
-      </w:pPr>
-      <w:r>
-        <w:rPr>
-          <w:rFonts w:ascii="Times New Roman" w:cs="Times New Roman" w:eastAsia="Times New Roman" w:hAnsi="Times New Roman"/>
-          <w:b/>
-          <w:bCs/>
-          <w:sz w:val="22"/>
-          <w:szCs w:val="22"/>
-        </w:rPr>
-        <w:t xml:space="preserve">8.</w:t>
-      </w:r>
-      <w:r>
-        <w:rPr>
-          <w:rFonts w:ascii="Times New Roman" w:cs="Times New Roman" w:eastAsia="Times New Roman" w:hAnsi="Times New Roman"/>
-          <w:sz w:val="22"/>
-          <w:szCs w:val="22"/>
-        </w:rPr>
-        <w:t xml:space="preserve">  Cuando el gobierno aplica un impuesto sobre las ventas de un bien, ¿quién soporta la carga tributaria?</w:t>
-      </w:r>
-    </w:p>
-    <w:p>
-      <w:pPr>
-        <w:spacing w:after="80" w:line="260"/>
-        <w:ind w:left="720"/>
-      </w:pPr>
-      <w:r>
-        <w:rPr>
-          <w:rFonts w:ascii="Times New Roman" w:cs="Times New Roman" w:eastAsia="Times New Roman" w:hAnsi="Times New Roman"/>
-          <w:b/>
-          <w:bCs/>
-          <w:sz w:val="22"/>
-          <w:szCs w:val="22"/>
-        </w:rPr>
-        <w:t xml:space="preserve">A) </w:t>
-      </w:r>
-      <w:r>
-        <w:rPr>
-          <w:rFonts w:ascii="Times New Roman" w:cs="Times New Roman" w:eastAsia="Times New Roman" w:hAnsi="Times New Roman"/>
-          <w:sz w:val="22"/>
-          <w:szCs w:val="22"/>
-        </w:rPr>
-        <w:t xml:space="preserve">Siempre el vendedor, porque es quien paga el impuesto formalmente.</w:t>
-      </w:r>
-    </w:p>
-    <w:p>
-      <w:pPr>
-        <w:spacing w:after="80" w:line="260"/>
-        <w:ind w:left="720"/>
-      </w:pPr>
-      <w:r>
-        <w:rPr>
-          <w:rFonts w:ascii="Times New Roman" w:cs="Times New Roman" w:eastAsia="Times New Roman" w:hAnsi="Times New Roman"/>
-          <w:b/>
-          <w:bCs/>
-          <w:sz w:val="22"/>
-          <w:szCs w:val="22"/>
-        </w:rPr>
-        <w:t xml:space="preserve">B) </w:t>
-      </w:r>
-      <w:r>
-        <w:rPr>
-          <w:rFonts w:ascii="Times New Roman" w:cs="Times New Roman" w:eastAsia="Times New Roman" w:hAnsi="Times New Roman"/>
-          <w:sz w:val="22"/>
-          <w:szCs w:val="22"/>
-        </w:rPr>
-        <w:t xml:space="preserve">Siempre el comprador, porque es quien consume el bien.</w:t>
-      </w:r>
-    </w:p>
-    <w:p>
-      <w:pPr>
-        <w:spacing w:after="80" w:line="260"/>
-        <w:ind w:left="720"/>
-      </w:pPr>
-      <w:r>
-        <w:rPr>
-          <w:rFonts w:ascii="Times New Roman" w:cs="Times New Roman" w:eastAsia="Times New Roman" w:hAnsi="Times New Roman"/>
-          <w:b/>
-          <w:bCs/>
-          <w:sz w:val="22"/>
-          <w:szCs w:val="22"/>
-        </w:rPr>
-        <w:t xml:space="preserve">C) </w:t>
-      </w:r>
-      <w:r>
-        <w:rPr>
-          <w:rFonts w:ascii="Times New Roman" w:cs="Times New Roman" w:eastAsia="Times New Roman" w:hAnsi="Times New Roman"/>
-          <w:sz w:val="22"/>
-          <w:szCs w:val="22"/>
-        </w:rPr>
-        <w:t xml:space="preserve">La carga se distribuye entre ambos según sus elasticidades, sin importar a quién se cobre formalmente.</w:t>
-      </w:r>
-    </w:p>
-    <w:p>
-      <w:pPr>
-        <w:spacing w:after="80" w:line="260"/>
-        <w:ind w:left="720"/>
-      </w:pPr>
-      <w:r>
-        <w:rPr>
-          <w:rFonts w:ascii="Times New Roman" w:cs="Times New Roman" w:eastAsia="Times New Roman" w:hAnsi="Times New Roman"/>
-          <w:b/>
-          <w:bCs/>
-          <w:sz w:val="22"/>
-          <w:szCs w:val="22"/>
-        </w:rPr>
-        <w:t xml:space="preserve">D) </w:t>
-      </w:r>
-      <w:r>
-        <w:rPr>
-          <w:rFonts w:ascii="Times New Roman" w:cs="Times New Roman" w:eastAsia="Times New Roman" w:hAnsi="Times New Roman"/>
-          <w:sz w:val="22"/>
-          <w:szCs w:val="22"/>
-        </w:rPr>
-        <w:t xml:space="preserve">El gobierno, porque es quien recauda el impuesto.</w:t>
-      </w:r>
-    </w:p>
-    <w:p>
-      <w:pPr>
-        <w:spacing w:after="120" w:before="0" w:line="260"/>
-        <w:jc w:val="left"/>
-      </w:pPr>
-      <w:r>
-        <w:rPr>
-          <w:rFonts w:ascii="Times New Roman" w:cs="Times New Roman" w:eastAsia="Times New Roman" w:hAnsi="Times New Roman"/>
-          <w:sz w:val="22"/>
-          <w:szCs w:val="22"/>
-        </w:rPr>
-        <w:t xml:space="preserve"/>
-      </w:r>
-    </w:p>
-    <w:p>
-      <w:pPr>
-        <w:spacing w:after="80" w:before="0" w:line="260"/>
-        <w:jc w:val="left"/>
-      </w:pPr>
-      <w:r>
-        <w:rPr>
-          <w:rFonts w:ascii="Times New Roman" w:cs="Times New Roman" w:eastAsia="Times New Roman" w:hAnsi="Times New Roman"/>
-          <w:b/>
-          <w:bCs/>
-          <w:sz w:val="22"/>
-          <w:szCs w:val="22"/>
-        </w:rPr>
-        <w:t xml:space="preserve">9.</w:t>
-      </w:r>
-      <w:r>
-        <w:rPr>
-          <w:rFonts w:ascii="Times New Roman" w:cs="Times New Roman" w:eastAsia="Times New Roman" w:hAnsi="Times New Roman"/>
-          <w:sz w:val="22"/>
-          <w:szCs w:val="22"/>
-        </w:rPr>
-        <w:t xml:space="preserve">  El </w:t>
-      </w:r>
-      <w:r>
-        <w:rPr>
-          <w:rFonts w:ascii="Times New Roman" w:cs="Times New Roman" w:eastAsia="Times New Roman" w:hAnsi="Times New Roman"/>
-          <w:b/>
-          <w:bCs/>
-          <w:sz w:val="22"/>
-          <w:szCs w:val="22"/>
-        </w:rPr>
-        <w:t xml:space="preserve">peso muerto</w:t>
-      </w:r>
-      <w:r>
-        <w:rPr>
-          <w:rFonts w:ascii="Times New Roman" w:cs="Times New Roman" w:eastAsia="Times New Roman" w:hAnsi="Times New Roman"/>
-          <w:sz w:val="22"/>
-          <w:szCs w:val="22"/>
-        </w:rPr>
-        <w:t xml:space="preserve"> (deadweight loss) de un impuesto es:</w:t>
-      </w:r>
-    </w:p>
-    <w:p>
-      <w:pPr>
-        <w:spacing w:after="80" w:line="260"/>
-        <w:ind w:left="720"/>
-      </w:pPr>
-      <w:r>
-        <w:rPr>
-          <w:rFonts w:ascii="Times New Roman" w:cs="Times New Roman" w:eastAsia="Times New Roman" w:hAnsi="Times New Roman"/>
-          <w:b/>
-          <w:bCs/>
-          <w:sz w:val="22"/>
-          <w:szCs w:val="22"/>
-        </w:rPr>
-        <w:t xml:space="preserve">A) </w:t>
-      </w:r>
-      <w:r>
-        <w:rPr>
-          <w:rFonts w:ascii="Times New Roman" w:cs="Times New Roman" w:eastAsia="Times New Roman" w:hAnsi="Times New Roman"/>
-          <w:sz w:val="22"/>
-          <w:szCs w:val="22"/>
-        </w:rPr>
-        <w:t xml:space="preserve">El ingreso total que recauda el gobierno.</w:t>
-      </w:r>
-    </w:p>
-    <w:p>
-      <w:pPr>
-        <w:spacing w:after="80" w:line="260"/>
-        <w:ind w:left="720"/>
-      </w:pPr>
-      <w:r>
-        <w:rPr>
-          <w:rFonts w:ascii="Times New Roman" w:cs="Times New Roman" w:eastAsia="Times New Roman" w:hAnsi="Times New Roman"/>
-          <w:b/>
-          <w:bCs/>
-          <w:sz w:val="22"/>
-          <w:szCs w:val="22"/>
-        </w:rPr>
-        <w:t xml:space="preserve">B) </w:t>
-      </w:r>
-      <w:r>
-        <w:rPr>
-          <w:rFonts w:ascii="Times New Roman" w:cs="Times New Roman" w:eastAsia="Times New Roman" w:hAnsi="Times New Roman"/>
-          <w:sz w:val="22"/>
-          <w:szCs w:val="22"/>
-        </w:rPr>
-        <w:t xml:space="preserve">La reducción del excedente del consumidor que pasa al gobierno como recaudación.</w:t>
-      </w:r>
-    </w:p>
-    <w:p>
-      <w:pPr>
-        <w:spacing w:after="80" w:line="260"/>
-        <w:ind w:left="720"/>
-      </w:pPr>
-      <w:r>
-        <w:rPr>
-          <w:rFonts w:ascii="Times New Roman" w:cs="Times New Roman" w:eastAsia="Times New Roman" w:hAnsi="Times New Roman"/>
-          <w:b/>
-          <w:bCs/>
-          <w:sz w:val="22"/>
-          <w:szCs w:val="22"/>
-        </w:rPr>
-        <w:t xml:space="preserve">C) </w:t>
-      </w:r>
-      <w:r>
-        <w:rPr>
-          <w:rFonts w:ascii="Times New Roman" w:cs="Times New Roman" w:eastAsia="Times New Roman" w:hAnsi="Times New Roman"/>
-          <w:sz w:val="22"/>
-          <w:szCs w:val="22"/>
-        </w:rPr>
-        <w:t xml:space="preserve">La pérdida de bienestar que no captura ningún agente: ni compradores, ni vendedores, ni el gobierno.</w:t>
-      </w:r>
-    </w:p>
-    <w:p>
-      <w:pPr>
-        <w:spacing w:after="80" w:line="260"/>
-        <w:ind w:left="720"/>
-      </w:pPr>
-      <w:r>
-        <w:rPr>
-          <w:rFonts w:ascii="Times New Roman" w:cs="Times New Roman" w:eastAsia="Times New Roman" w:hAnsi="Times New Roman"/>
-          <w:b/>
-          <w:bCs/>
-          <w:sz w:val="22"/>
-          <w:szCs w:val="22"/>
-        </w:rPr>
-        <w:t xml:space="preserve">D) </w:t>
-      </w:r>
-      <w:r>
-        <w:rPr>
-          <w:rFonts w:ascii="Times New Roman" w:cs="Times New Roman" w:eastAsia="Times New Roman" w:hAnsi="Times New Roman"/>
-          <w:sz w:val="22"/>
-          <w:szCs w:val="22"/>
-        </w:rPr>
-        <w:t xml:space="preserve">El costo administrativo de recaudar el impuesto.</w:t>
-      </w:r>
-    </w:p>
-    <w:p>
-      <w:pPr>
-        <w:spacing w:after="120" w:before="0" w:line="260"/>
-        <w:jc w:val="left"/>
-      </w:pPr>
-      <w:r>
-        <w:rPr>
-          <w:rFonts w:ascii="Times New Roman" w:cs="Times New Roman" w:eastAsia="Times New Roman" w:hAnsi="Times New Roman"/>
-          <w:sz w:val="22"/>
-          <w:szCs w:val="22"/>
-        </w:rPr>
-        <w:t xml:space="preserve"/>
-      </w:r>
-    </w:p>
-    <w:p>
-      <w:pPr>
-        <w:spacing w:after="80" w:before="0" w:line="260"/>
-        <w:jc w:val="left"/>
-      </w:pPr>
-      <w:r>
-        <w:rPr>
-          <w:rFonts w:ascii="Times New Roman" w:cs="Times New Roman" w:eastAsia="Times New Roman" w:hAnsi="Times New Roman"/>
-          <w:b/>
-          <w:bCs/>
-          <w:sz w:val="22"/>
-          <w:szCs w:val="22"/>
-        </w:rPr>
-        <w:t xml:space="preserve">10.</w:t>
-      </w:r>
-      <w:r>
-        <w:rPr>
-          <w:rFonts w:ascii="Times New Roman" w:cs="Times New Roman" w:eastAsia="Times New Roman" w:hAnsi="Times New Roman"/>
-          <w:sz w:val="22"/>
-          <w:szCs w:val="22"/>
-        </w:rPr>
-        <w:t xml:space="preserve">  ¿Cuál de las siguientes situaciones es un ejemplo de </w:t>
-      </w:r>
-      <w:r>
-        <w:rPr>
-          <w:rFonts w:ascii="Times New Roman" w:cs="Times New Roman" w:eastAsia="Times New Roman" w:hAnsi="Times New Roman"/>
-          <w:b/>
-          <w:bCs/>
-          <w:sz w:val="22"/>
-          <w:szCs w:val="22"/>
-        </w:rPr>
-        <w:t xml:space="preserve">externalidad negativa</w:t>
-      </w:r>
-      <w:r>
-        <w:rPr>
-          <w:rFonts w:ascii="Times New Roman" w:cs="Times New Roman" w:eastAsia="Times New Roman" w:hAnsi="Times New Roman"/>
-          <w:sz w:val="22"/>
-          <w:szCs w:val="22"/>
-        </w:rPr>
-        <w:t xml:space="preserve">?</w:t>
-      </w:r>
-    </w:p>
-    <w:p>
-      <w:pPr>
-        <w:spacing w:after="80" w:line="260"/>
-        <w:ind w:left="720"/>
-      </w:pPr>
-      <w:r>
-        <w:rPr>
-          <w:rFonts w:ascii="Times New Roman" w:cs="Times New Roman" w:eastAsia="Times New Roman" w:hAnsi="Times New Roman"/>
-          <w:b/>
-          <w:bCs/>
-          <w:sz w:val="22"/>
-          <w:szCs w:val="22"/>
-        </w:rPr>
-        <w:t xml:space="preserve">A) </w:t>
-      </w:r>
-      <w:r>
-        <w:rPr>
-          <w:rFonts w:ascii="Times New Roman" w:cs="Times New Roman" w:eastAsia="Times New Roman" w:hAnsi="Times New Roman"/>
-          <w:sz w:val="22"/>
-          <w:szCs w:val="22"/>
-        </w:rPr>
-        <w:t xml:space="preserve">Una vacuna que protege a quienes rodean al vacunado.</w:t>
-      </w:r>
-    </w:p>
-    <w:p>
-      <w:pPr>
-        <w:spacing w:after="80" w:line="260"/>
-        <w:ind w:left="720"/>
-      </w:pPr>
-      <w:r>
-        <w:rPr>
-          <w:rFonts w:ascii="Times New Roman" w:cs="Times New Roman" w:eastAsia="Times New Roman" w:hAnsi="Times New Roman"/>
-          <w:b/>
-          <w:bCs/>
-          <w:sz w:val="22"/>
-          <w:szCs w:val="22"/>
-        </w:rPr>
-        <w:t xml:space="preserve">B) </w:t>
-      </w:r>
-      <w:r>
-        <w:rPr>
-          <w:rFonts w:ascii="Times New Roman" w:cs="Times New Roman" w:eastAsia="Times New Roman" w:hAnsi="Times New Roman"/>
-          <w:sz w:val="22"/>
-          <w:szCs w:val="22"/>
-        </w:rPr>
-        <w:t xml:space="preserve">Una fábrica que contamina el río con sus desechos industriales, perjudicando a los vecinos.</w:t>
-      </w:r>
-    </w:p>
-    <w:p>
-      <w:pPr>
-        <w:spacing w:after="80" w:line="260"/>
-        <w:ind w:left="720"/>
-      </w:pPr>
-      <w:r>
-        <w:rPr>
-          <w:rFonts w:ascii="Times New Roman" w:cs="Times New Roman" w:eastAsia="Times New Roman" w:hAnsi="Times New Roman"/>
-          <w:b/>
-          <w:bCs/>
-          <w:sz w:val="22"/>
-          <w:szCs w:val="22"/>
-        </w:rPr>
-        <w:t xml:space="preserve">C) </w:t>
-      </w:r>
-      <w:r>
-        <w:rPr>
-          <w:rFonts w:ascii="Times New Roman" w:cs="Times New Roman" w:eastAsia="Times New Roman" w:hAnsi="Times New Roman"/>
-          <w:sz w:val="22"/>
-          <w:szCs w:val="22"/>
-        </w:rPr>
-        <w:t xml:space="preserve">Un subsidio estatal a la educación universitaria.</w:t>
-      </w:r>
-    </w:p>
-    <w:p>
-      <w:pPr>
-        <w:spacing w:after="80" w:line="260"/>
-        <w:ind w:left="720"/>
-      </w:pPr>
-      <w:r>
-        <w:rPr>
-          <w:rFonts w:ascii="Times New Roman" w:cs="Times New Roman" w:eastAsia="Times New Roman" w:hAnsi="Times New Roman"/>
-          <w:b/>
-          <w:bCs/>
-          <w:sz w:val="22"/>
-          <w:szCs w:val="22"/>
-        </w:rPr>
-        <w:t xml:space="preserve">D) </w:t>
-      </w:r>
-      <w:r>
-        <w:rPr>
-          <w:rFonts w:ascii="Times New Roman" w:cs="Times New Roman" w:eastAsia="Times New Roman" w:hAnsi="Times New Roman"/>
-          <w:sz w:val="22"/>
-          <w:szCs w:val="22"/>
-        </w:rPr>
-        <w:t xml:space="preserve">Todas las anteriores son externalidades.</w:t>
       </w:r>
     </w:p>
     <w:p>
@@ -2319,7 +2319,25 @@
           <w:sz w:val="22"/>
           <w:szCs w:val="22"/>
         </w:rPr>
-        <w:t xml:space="preserve">El Ministerio de Salud publica un estudio sobre los riesgos del consumo excesivo de harinas blancas y los consumidores </w:t>
+        <w:t xml:space="preserve">El </w:t>
+      </w:r>
+      <w:r>
+        <w:rPr>
+          <w:rFonts w:ascii="Times New Roman" w:cs="Times New Roman" w:eastAsia="Times New Roman" w:hAnsi="Times New Roman"/>
+          <w:b/>
+          <w:bCs/>
+          <w:sz w:val="22"/>
+          <w:szCs w:val="22"/>
+        </w:rPr>
+        <w:t xml:space="preserve">Ministerio de Salud Pública</w:t>
+      </w:r>
+      <w:r>
+        <w:rPr>
+          <w:rFonts w:ascii="Times New Roman" w:cs="Times New Roman" w:eastAsia="Times New Roman" w:hAnsi="Times New Roman"/>
+          <w:sz w:val="22"/>
+          <w:szCs w:val="22"/>
+        </w:rPr>
+        <w:t xml:space="preserve"> publica un estudio sobre los riesgos del consumo excesivo de harinas blancas y los consumidores </w:t>
       </w:r>
       <w:r>
         <w:rPr>

</xml_diff>